<commit_message>
fix(health-econ): correct microsim capacity denominator + per-capita impoverishment
Final-review CRITICAL: simulate_policy computed counterfactual capacity-to-pay
as food spending (the construct redefinition in 7a left the old formula
referencing cons_nonfood, which now equals capacity). Fixed to non-food
consumption (cons_total - food); microsim impoverishment now uses per-capita
OOP, consistent with Table 3. Added partial-cover regression test. Regenerated
all tables/figures and propagated corrected deltas (inpatient -2.0 pp,
outpatient -17.8 pp) through the manuscript package.

Co-Authored-By: Claude Opus 4.8 <noreply@anthropic.com>
</commit_message>
<xml_diff>
--- a/india-ageing-atlas/submission_assets/MJDRDYPU_HEALTH_ECONOMICS_ELDERLY_2026-06-25/internal_review.docx
+++ b/india-ageing-atlas/submission_assets/MJDRDYPU_HEALTH_ECONOMICS_ELDERLY_2026-06-25/internal_review.docx
@@ -159,7 +159,7 @@
         <w:t xml:space="preserve"> </w:t>
       </w:r>
       <w:r>
-        <w:t xml:space="preserve">The household outpatient variable picks up medicines bought alongside a consultation or test, but older adults with stable chronic disease often refill prescriptions at a pharmacy with no accompanying visit in the recall window. If that spending is missed, the headline 16.1-percentage-point benefit of outpatient cover (Scenario S2) could itself be an underestimate, which is a stronger claim than</w:t>
+        <w:t xml:space="preserve">The household outpatient variable picks up medicines bought alongside a consultation or test, but older adults with stable chronic disease often refill prescriptions at a pharmacy with no accompanying visit in the recall window. If that spending is missed, the headline 17.8-percentage-point benefit of outpatient cover (Scenario S2) could itself be an underestimate, which is a stronger claim than</w:t>
       </w:r>
       <w:r>
         <w:t xml:space="preserve"> </w:t>
@@ -480,7 +480,7 @@
           <w:b/>
           <w:bCs/>
         </w:rPr>
-        <w:t xml:space="preserve">The 1.8-versus-16.1-percentage-point comparison is the paper’s strongest asset — protect it from being diluted by the combined scenario.</w:t>
+        <w:t xml:space="preserve">The 2.0-versus-17.8-percentage-point comparison is the paper’s strongest asset — protect it from being diluted by the combined scenario.</w:t>
       </w:r>
       <w:r>
         <w:t xml:space="preserve"> </w:t>

</xml_diff>